<commit_message>
Refine verification lab flow and final report
</commit_message>
<xml_diff>
--- a/AI Arena Final Document.docx
+++ b/AI Arena Final Document.docx
@@ -5,13 +5,16 @@
     <w:p>
       <w:pPr>
         <w:pStyle w:val="Heading1"/>
+        <w:jc w:val="center"/>
         <w:rPr>
+          <w:rFonts w:ascii="Times New Roman" w:hAnsi="Times New Roman" w:cs="Times New Roman"/>
           <w:sz w:val="20"/>
           <w:szCs w:val="20"/>
         </w:rPr>
       </w:pPr>
       <w:r>
         <w:rPr>
+          <w:rFonts w:ascii="Times New Roman" w:hAnsi="Times New Roman" w:cs="Times New Roman"/>
           <w:sz w:val="20"/>
           <w:szCs w:val="20"/>
         </w:rPr>
@@ -20,214 +23,174 @@
     </w:p>
     <w:p>
       <w:pPr>
+        <w:jc w:val="center"/>
         <w:rPr>
+          <w:rFonts w:ascii="Times New Roman" w:hAnsi="Times New Roman" w:cs="Times New Roman"/>
           <w:sz w:val="20"/>
           <w:szCs w:val="20"/>
         </w:rPr>
       </w:pPr>
       <w:r>
         <w:rPr>
+          <w:rFonts w:ascii="Times New Roman" w:hAnsi="Times New Roman" w:cs="Times New Roman"/>
           <w:sz w:val="20"/>
           <w:szCs w:val="20"/>
         </w:rPr>
-        <w:t>CS 4660 Project</w:t>
+        <w:t>CS 4660</w:t>
       </w:r>
     </w:p>
     <w:p>
       <w:pPr>
         <w:pStyle w:val="Heading1"/>
         <w:rPr>
+          <w:rFonts w:ascii="Times New Roman" w:hAnsi="Times New Roman" w:cs="Times New Roman"/>
           <w:sz w:val="20"/>
           <w:szCs w:val="20"/>
         </w:rPr>
       </w:pPr>
       <w:r>
-        <w:rPr>
-          <w:sz w:val="20"/>
-          <w:szCs w:val="20"/>
-        </w:rPr>
         <w:t>Description of How the Design Disrupts Typical Teaching</w:t>
       </w:r>
     </w:p>
     <w:p>
       <w:pPr>
         <w:rPr>
+          <w:rFonts w:ascii="Times New Roman" w:hAnsi="Times New Roman" w:cs="Times New Roman"/>
           <w:sz w:val="20"/>
           <w:szCs w:val="20"/>
         </w:rPr>
       </w:pPr>
       <w:r>
-        <w:rPr>
-          <w:sz w:val="20"/>
-          <w:szCs w:val="20"/>
-        </w:rPr>
-        <w:t>Responsible classroom AI use is often taught through static policy statements, a short lecture, or a one-time warning in an assignment sheet. Those approaches usually frame the topic as compliance rather than as a practice students need to develop in context. AI Arena disrupts that pattern by turning the topic into a learner-centered, interactive game built around realistic computer science scenarios. Instead of only reading rules, students repeatedly decide how to verify suspicious AI claims, how to test generated code, and how to distinguish acceptable support from AI doing the work for them.</w:t>
+        <w:t>Responsible classroom AI use is often taught through a static policy statement, a short lecture, or a warning on an assignment sheet. Those formats tell students what not to do, but they rarely give students practice making good decisions while working with AI-generated material. AI Arena disrupts that pattern by reframing the topic as a solo verification lab built around realistic CS cases. Learners inspect prompts, model outputs, and generated code, then decide what to trust, how to verify it, and whether a use of AI stays inside classroom expectations.</w:t>
       </w:r>
     </w:p>
     <w:p>
       <w:pPr>
         <w:rPr>
+          <w:rFonts w:ascii="Times New Roman" w:hAnsi="Times New Roman" w:cs="Times New Roman"/>
           <w:sz w:val="20"/>
           <w:szCs w:val="20"/>
         </w:rPr>
       </w:pPr>
       <w:r>
-        <w:rPr>
-          <w:sz w:val="20"/>
-          <w:szCs w:val="20"/>
-        </w:rPr>
-        <w:t>This design is better than existing options because it gives students immediate formative feedback, category-specific hints, and repeated opportunities to apply judgment in situations that resemble actual coursework. The game format also makes the sociotechnical side of the topic visible: learners are not just memorizing whether AI is allowed, but practicing how classroom policy, technical verification, and their own reasoning interact. In that sense, the design moves beyond an informational webpage or policy handout and instead creates an experience where students build verification habits through participation.</w:t>
+        <w:t>This design is better than common alternatives because it turns policy into repeated situated practice. Students get immediate formative feedback, category-specific scaffolds, realistic prompt-and-output examples, and a required post-case reflection that asks them to choose the lesson they want to carry forward and optionally leave themselves a short note. The system also makes the sociotechnical side of classroom AI use visible: learners have to connect technical verification, course rules, and their own reasoning instead of treating AI use as a simple yes-or-no rule.</w:t>
       </w:r>
     </w:p>
     <w:p>
       <w:pPr>
         <w:pStyle w:val="Heading1"/>
         <w:rPr>
+          <w:rFonts w:ascii="Times New Roman" w:hAnsi="Times New Roman" w:cs="Times New Roman"/>
           <w:sz w:val="20"/>
           <w:szCs w:val="20"/>
         </w:rPr>
       </w:pPr>
       <w:r>
-        <w:rPr>
-          <w:sz w:val="20"/>
-          <w:szCs w:val="20"/>
-        </w:rPr>
         <w:t>Summary and Rationale for Design Changes</w:t>
       </w:r>
     </w:p>
     <w:p>
       <w:pPr>
         <w:rPr>
+          <w:rFonts w:ascii="Times New Roman" w:hAnsi="Times New Roman" w:cs="Times New Roman"/>
           <w:sz w:val="20"/>
           <w:szCs w:val="20"/>
         </w:rPr>
       </w:pPr>
       <w:r>
-        <w:rPr>
-          <w:sz w:val="20"/>
-          <w:szCs w:val="20"/>
-        </w:rPr>
-        <w:t>Expanded the core experience from a simple policy-oriented idea into a multi-round game with several kinds of decisions, including hallucination spotting, code verification, evidence matching, and prompt surgery. This made the project better aligned with the real range of choices students face when using AI in CS courses and prevented the design from collapsing into a single yes-or-no policy quiz.</w:t>
+        <w:t>- Expanded the experience from a simple policy-oriented concept into a multi-case web app covering hallucination checks, code verification, evidence matching, and prompt surgery. This made the project better aligned with the range of decisions students actually face in CS coursework.</w:t>
       </w:r>
     </w:p>
     <w:p>
       <w:pPr>
         <w:rPr>
+          <w:rFonts w:ascii="Times New Roman" w:hAnsi="Times New Roman" w:cs="Times New Roman"/>
           <w:sz w:val="20"/>
           <w:szCs w:val="20"/>
         </w:rPr>
       </w:pPr>
       <w:r>
-        <w:rPr>
-          <w:sz w:val="20"/>
-          <w:szCs w:val="20"/>
-        </w:rPr>
-        <w:t>Added immediate explanatory feedback, category-based hints, and a persistent classroom framework. These changes made the game more supportive of learning rather than only scoring performance, and they reinforced the idea that students should verify technical claims and use AI as a coach instead of a substitute.</w:t>
+        <w:t>- Shifted the framing away from a competitive quiz model and into a verification lab. Removing fake classmates and leaderboard language made the design feel more learner-centered and more consistent with the project goal of building judgment rather than speed or competition.</w:t>
       </w:r>
     </w:p>
     <w:p>
       <w:pPr>
         <w:rPr>
+          <w:rFonts w:ascii="Times New Roman" w:hAnsi="Times New Roman" w:cs="Times New Roman"/>
           <w:sz w:val="20"/>
           <w:szCs w:val="20"/>
         </w:rPr>
       </w:pPr>
       <w:r>
-        <w:rPr>
-          <w:sz w:val="20"/>
-          <w:szCs w:val="20"/>
-        </w:rPr>
-        <w:t>Added a metacognitive reflection step after each question and then condensed the layout so a full round fits on one screen. The reflection step encouraged learners to notice the reasoning strategy that helped them or the adjustment they wanted to make next, while the condensed layout reduced friction and kept the interaction focused on one coherent decision cycle.</w:t>
+        <w:t>- Redesigned the hallucination cases so students see both the original prompt and the model output, which makes the activity feel more like a real AI interaction and gives learners clearer evidence to inspect.</w:t>
       </w:r>
     </w:p>
     <w:p>
       <w:pPr>
         <w:pStyle w:val="Heading1"/>
         <w:rPr>
+          <w:rFonts w:ascii="Times New Roman" w:hAnsi="Times New Roman" w:cs="Times New Roman"/>
           <w:sz w:val="20"/>
           <w:szCs w:val="20"/>
         </w:rPr>
       </w:pPr>
       <w:r>
+        <w:t>- Strengthened the metacognitive step over time, moving from a lightweight prompt into a full reflection overlay that appears after each solved case. Learners now choose a lesson to carry forward, can leave a short write-up, and then continue immediately into the next case.</w:t>
+      </w:r>
+    </w:p>
+    <w:p>
+      <w:pPr>
         <w:rPr>
+          <w:rFonts w:ascii="Times New Roman" w:hAnsi="Times New Roman" w:cs="Times New Roman"/>
           <w:sz w:val="20"/>
           <w:szCs w:val="20"/>
         </w:rPr>
+      </w:pPr>
+      <w:r>
         <w:t>Aspects to Improve in Future Iterations</w:t>
       </w:r>
     </w:p>
     <w:p>
       <w:pPr>
         <w:rPr>
+          <w:rFonts w:ascii="Times New Roman" w:hAnsi="Times New Roman" w:cs="Times New Roman"/>
           <w:sz w:val="20"/>
           <w:szCs w:val="20"/>
         </w:rPr>
       </w:pPr>
       <w:r>
-        <w:rPr>
-          <w:sz w:val="20"/>
-          <w:szCs w:val="20"/>
-        </w:rPr>
-        <w:t xml:space="preserve">A future iteration could deepen the adaptive side of the game. Right now, every learner receives the same sequence of questions, hints, and reflection choices. The next version could vary difficulty based on student performance, unlock more advanced scenarios for students who are succeeding quickly, or offer extra scaffolding when a learner repeatedly struggles with one category. That would </w:t>
-      </w:r>
-      <w:r>
-        <w:rPr>
-          <w:sz w:val="20"/>
-          <w:szCs w:val="20"/>
-        </w:rPr>
-        <w:lastRenderedPageBreak/>
-        <w:t>make the system feel more responsive to individual learning needs rather than only presenting a polished fixed sequence.</w:t>
+        <w:t>A future iteration could make the system more adaptive. Right now, every learner still moves through a fixed sequence of cases. A stronger version could adjust difficulty by category, surface extra scaffolding when a student repeatedly struggles with one kind of judgment, or unlock more advanced cases when a learner is consistently successful.</w:t>
       </w:r>
     </w:p>
     <w:p>
       <w:pPr>
         <w:rPr>
+          <w:rFonts w:ascii="Times New Roman" w:hAnsi="Times New Roman" w:cs="Times New Roman"/>
           <w:sz w:val="20"/>
           <w:szCs w:val="20"/>
         </w:rPr>
       </w:pPr>
       <w:r>
-        <w:rPr>
-          <w:sz w:val="20"/>
-          <w:szCs w:val="20"/>
-        </w:rPr>
-        <w:t>The design could also become more socially and instructionally integrated. For example, a teacher-facing dashboard could summarize class-level patterns, such as whether students are over-trusting polished AI language or underusing documentation as evidence. The game could also support course-specific policy customization so the green/yellow/red framework reflects the actual rules of a given instructor or assignment. Those changes would strengthen the sociotechnical dimension by connecting the learner experience more directly to classroom context.</w:t>
-      </w:r>
-    </w:p>
-    <w:p>
-      <w:pPr>
-        <w:rPr>
-          <w:sz w:val="20"/>
-          <w:szCs w:val="20"/>
-        </w:rPr>
-      </w:pPr>
-      <w:r>
-        <w:rPr>
-          <w:sz w:val="20"/>
-          <w:szCs w:val="20"/>
-        </w:rPr>
-        <w:t>Finally, the project could improve accessibility and authenticity. More keyboard-first interaction, stronger screen-reader affordances, and clearer support for different screen sizes would make the tool more inclusive. On the content side, future rounds could use richer examples drawn from real debugging workflows, collaborative programming situations, or research tasks so that students are practicing judgment in even more authentic contexts.</w:t>
+        <w:t>The project could also become more instructionally integrated. A teacher-facing summary view could show which habits students are developing, which verification moves they are underusing, and what reflection themes appear most often. Instructors could also customize classroom policy language so the green/yellow/red framework matches their own course norms and assignments.</w:t>
       </w:r>
     </w:p>
     <w:p>
       <w:pPr>
         <w:pStyle w:val="Heading1"/>
         <w:rPr>
+          <w:rFonts w:ascii="Times New Roman" w:hAnsi="Times New Roman" w:cs="Times New Roman"/>
           <w:sz w:val="20"/>
           <w:szCs w:val="20"/>
         </w:rPr>
       </w:pPr>
       <w:r>
-        <w:rPr>
-          <w:sz w:val="20"/>
-          <w:szCs w:val="20"/>
-        </w:rPr>
-        <w:t>Contribution of Each Team Member</w:t>
+        <w:t>Finally, future work should deepen accessibility and authenticity. Better keyboard support, stronger screen-reader affordances, and more careful mobile tuning would make the experience more inclusive. The cases could also become more authentic by drawing from richer debugging workflows, collaborative programming situations, and course-specific examples rather than short standalone prompts.</w:t>
       </w:r>
     </w:p>
     <w:p>
       <w:pPr>
         <w:rPr>
+          <w:rFonts w:ascii="Times New Roman" w:hAnsi="Times New Roman" w:cs="Times New Roman"/>
           <w:sz w:val="20"/>
           <w:szCs w:val="20"/>
         </w:rPr>
@@ -237,46 +200,42 @@
       <w:pPr>
         <w:pStyle w:val="Heading1"/>
         <w:rPr>
+          <w:rFonts w:ascii="Times New Roman" w:hAnsi="Times New Roman" w:cs="Times New Roman"/>
           <w:sz w:val="20"/>
           <w:szCs w:val="20"/>
         </w:rPr>
       </w:pPr>
       <w:r>
+        <w:t>Contribution of Each Team Member</w:t>
+      </w:r>
+    </w:p>
+    <w:p>
+      <w:pPr>
         <w:rPr>
+          <w:rFonts w:ascii="Times New Roman" w:hAnsi="Times New Roman" w:cs="Times New Roman"/>
           <w:sz w:val="20"/>
           <w:szCs w:val="20"/>
         </w:rPr>
+      </w:pPr>
+      <w:r>
         <w:t>AI Disclosure Statement</w:t>
       </w:r>
     </w:p>
     <w:p>
       <w:pPr>
         <w:rPr>
+          <w:rFonts w:ascii="Times New Roman" w:hAnsi="Times New Roman" w:cs="Times New Roman"/>
           <w:sz w:val="20"/>
           <w:szCs w:val="20"/>
         </w:rPr>
       </w:pPr>
       <w:r>
-        <w:rPr>
-          <w:sz w:val="20"/>
-          <w:szCs w:val="20"/>
-        </w:rPr>
-        <w:t>AI tools were used during this project as support for brainstorming, interface and content iteration, drafting and revising parts of the HTML/CSS/JavaScript, debugging, and helping prepare written documentation. These tools were also used to suggest improvements to the learning interaction, including the metacognitive reflection step and later layout refinements.</w:t>
+        <w:t>AI tools were used throughout the project as support for brainstorming, interface copy, HTML/CSS/JavaScript iteration, debugging, scenario revision, shifting the interaction from a quiz-game frame into a verification lab, strengthening the reflection flow, and drafting or revising written documentation including this report.</w:t>
       </w:r>
     </w:p>
     <w:p>
-      <w:pPr>
-        <w:rPr>
-          <w:sz w:val="20"/>
-          <w:szCs w:val="20"/>
-        </w:rPr>
-      </w:pPr>
       <w:r>
-        <w:rPr>
-          <w:sz w:val="20"/>
-          <w:szCs w:val="20"/>
-        </w:rPr>
-        <w:t>All AI-generated suggestions were reviewed, edited, and integrated by the team, and the team remained responsible for the final design decisions, the educational framing, the correctness of the project content, and the submitted deliverables. AI was used as a support tool within the design process rather than as a substitute for the team's authorship or judgment.</w:t>
+        <w:t>All AI-generated suggestions were reviewed, edited, and integrated by the team. The team remained responsible for the learning goals, educational framing, scenario accuracy, code behavior, final writing, and submitted deliverables. AI was used as a support tool within the design process rather than as a substitute for the team's authorship, judgment, or decision making.</w:t>
       </w:r>
     </w:p>
     <w:sectPr>

</xml_diff>